<commit_message>
REQ-001792: el abono separa IVA y R.E. en el resumen y en el total de la especificación (Hagen 1.0.0.1780)
El estándar 1307 suma en TotalECAmount el R.E. ya acumulado del grupo en cada línea (sale
de más con varias líneas del mismo IVA), y su TotalVATAmount y la línea de IVA del resumen
llevan IVA y R.E. juntos. La extensión suma IVA y R.E. sobre la especificación
(TotalIVA_Hagen, TotalRE_Hagen), el layout del abono los usa en el total, y el resumen
pasa a tener «Importe IVA» sin R.E. y una línea «Importe RE» debajo. Se quita la línea
«Importe IVA (DL)», que en un abono en euros repetía el IVA.

Probado en el Sandbox de Hagen con el abono de la clienta 17101: 8,04 + 0,80 + 0,11 = 8,95.

Co-Authored-By: Claude Opus 5.5 <noreply@anthropic.com>
</commit_message>
<xml_diff>
--- a/src/reportextension/Layouts/StandardSalesCreditMemo.docx
+++ b/src/reportextension/Layouts/StandardSalesCreditMemo.docx
@@ -2448,9 +2448,9 @@
             <w:placeholder>
               <w:docPart w:val="DefaultPlaceholder_-1854013440"/>
             </w:placeholder>
-            <w:dataBinding w:prefixMappings="xmlns:ns0='urn:microsoft-dynamics-nav/reports/Standard_Sales_Credit_Memo/1307/'" w:xpath="/ns0:NavWordReportXmlPart[1]/ns0:Header[1]/ns0:Totals[1]/ns0:TotalVATAmount[1]" w:storeItemID="{54F5B11A-FF59-464C-BEF9-25E13AA26774}"/>
+            <w:dataBinding w:prefixMappings="xmlns:ns0='urn:microsoft-dynamics-nav/reports/Standard_Sales_Credit_Memo/1307/'" w:xpath="/ns0:NavWordReportXmlPart[1]/ns0:Header[1]/ns0:Totals[1]/ns0:TotalIVA_Hagen[1]" w:storeItemID="{54F5B11A-FF59-464C-BEF9-25E13AA26774}"/>
             <w:text/>
-            <w:alias w:val="#Nav: /Header/Totals/TotalVATAmount"/>
+            <w:alias w:val="#Nav: /Header/Totals/TotalIVA_Hagen"/>
             <w:tag w:val="#Nav: Standard_Sales_Credit_Memo/1307"/>
           </w:sdtPr>
           <w:sdtContent>
@@ -2483,7 +2483,7 @@
                     <w:sz w:val="16"/>
                     <w:szCs w:val="16"/>
                   </w:rPr>
-                  <w:t>TotalVATAmount</w:t>
+                  <w:t>TotalIVA_Hagen</w:t>
                 </w:r>
                 <w:proofErr w:type="spellEnd"/>
               </w:p>
@@ -2520,13 +2520,13 @@
               <w:sz w:val="16"/>
               <w:szCs w:val="16"/>
             </w:rPr>
-            <w:alias w:val="#Nav: /Header/Totals/TotalECAmount"/>
+            <w:alias w:val="#Nav: /Header/Totals/TotalRE_Hagen"/>
             <w:tag w:val="#Nav: Standard_Sales_Credit_Memo/1307"/>
             <w:id w:val="939181234"/>
             <w:placeholder>
               <w:docPart w:val="DefaultPlaceholder_-1854013440"/>
             </w:placeholder>
-            <w:dataBinding w:prefixMappings="xmlns:ns0='urn:microsoft-dynamics-nav/reports/Standard_Sales_Credit_Memo/1307/'" w:xpath="/ns0:NavWordReportXmlPart[1]/ns0:Header[1]/ns0:Totals[1]/ns0:TotalECAmount[1]" w:storeItemID="{54F5B11A-FF59-464C-BEF9-25E13AA26774}"/>
+            <w:dataBinding w:prefixMappings="xmlns:ns0='urn:microsoft-dynamics-nav/reports/Standard_Sales_Credit_Memo/1307/'" w:xpath="/ns0:NavWordReportXmlPart[1]/ns0:Header[1]/ns0:Totals[1]/ns0:TotalRE_Hagen[1]" w:storeItemID="{54F5B11A-FF59-464C-BEF9-25E13AA26774}"/>
             <w:text/>
           </w:sdtPr>
           <w:sdtContent>
@@ -2559,7 +2559,7 @@
                     <w:sz w:val="16"/>
                     <w:szCs w:val="16"/>
                   </w:rPr>
-                  <w:t>TotalECAmount</w:t>
+                  <w:t>TotalRE_Hagen</w:t>
                 </w:r>
                 <w:proofErr w:type="spellEnd"/>
               </w:p>
@@ -13274,6 +13274,8 @@
  
              < R e p o r t N a m e > R e p o r t   N a m e < / R e p o r t N a m e >   
+             < R e p o r t C a p t i o n > R e p o r t   C a p t i o n < / R e p o r t C a p t i o n > + 
              < A b o u t T h i s R e p o r t T i t l e > A b o u t   T h i s   R e p o r t   T i t l e < / A b o u t T h i s R e p o r t T i t l e >   
              < A b o u t T h i s R e p o r t T e x t > A b o u t   T h i s   R e p o r t   T e x t < / A b o u t T h i s R e p o r t T e x t > @@ -13320,6 +13322,84 @@
  
          < / R e p o r t R e q u e s t >   
+         < C o m p a n y M e t a d a t a > + 
+             < C o m p a n y N a m e > C o m p a n y   N a m e < / C o m p a n y N a m e > + 
+             < C o m p a n y D i s p l a y N a m e > C o m p a n y   D i s p l a y   N a m e < / C o m p a n y D i s p l a y N a m e > + 
+             < C o m p a n y A d d r e s s L i n e s > + 
+                 < C o m p a n y A d d r e s s L i n e 1 > C o m p a n y   A d d r e s s   L i n e   1 < / C o m p a n y A d d r e s s L i n e 1 > + 
+                 < C o m p a n y A d d r e s s L i n e 2 > C o m p a n y   A d d r e s s   L i n e   2 < / C o m p a n y A d d r e s s L i n e 2 > + 
+                 < C o m p a n y A d d r e s s L i n e 3 > C o m p a n y   A d d r e s s   L i n e   3 < / C o m p a n y A d d r e s s L i n e 3 > + 
+                 < C o m p a n y A d d r e s s L i n e 4 > C o m p a n y   A d d r e s s   L i n e   4 < / C o m p a n y A d d r e s s L i n e 4 > + 
+                 < C o m p a n y A d d r e s s L i n e 5 > C o m p a n y   A d d r e s s   L i n e   5 < / C o m p a n y A d d r e s s L i n e 5 > + 
+                 < C o m p a n y A d d r e s s L i n e 6 > C o m p a n y   A d d r e s s   L i n e   6 < / C o m p a n y A d d r e s s L i n e 6 > + 
+                 < C o m p a n y A d d r e s s L i n e 7 > C o m p a n y   A d d r e s s   L i n e   7 < / C o m p a n y A d d r e s s L i n e 7 > + 
+                 < C o m p a n y A d d r e s s L i n e 8 > C o m p a n y   A d d r e s s   L i n e   8 < / C o m p a n y A d d r e s s L i n e 8 > + 
+             < / C o m p a n y A d d r e s s L i n e s > + 
+             < C o m p a n y P h o n e > C o m p a n y   P h o n e < / C o m p a n y P h o n e > + 
+             < C o m p a n y P h o n e C a p t i o n > C o m p a n y   P h o n e   C a p t i o n < / C o m p a n y P h o n e C a p t i o n > + 
+             < C o m p a n y F a x N o > C o m p a n y   F a x   N o . < / C o m p a n y F a x N o > + 
+             < C o m p a n y F a x N o C a p t i o n > C o m p a n y   F a x   N o .   C a p t i o n < / C o m p a n y F a x N o C a p t i o n > + 
+             < C o m p a n y E m a i l > C o m p a n y   E m a i l < / C o m p a n y E m a i l > + 
+             < C o m p a n y E m a i l C a p t i o n > C o m p a n y   E m a i l   C a p t i o n < / C o m p a n y E m a i l C a p t i o n > + 
+             < C o m p a n y H o m e P a g e > C o m p a n y   H o m e   P a g e < / C o m p a n y H o m e P a g e > + 
+             < C o m p a n y H o m e P a g e C a p t i o n > C o m p a n y   H o m e   P a g e   C a p t i o n < / C o m p a n y H o m e P a g e C a p t i o n > + 
+             < C o m p a n y L o g o > C o m p a n y   L o g o < / C o m p a n y L o g o > + 
+             < C o m p a n y V A T R e g i s t r a t i o n N o > C o m p a n y   V A T   R e g i s t r a t i o n   N o . < / C o m p a n y V A T R e g i s t r a t i o n N o > + 
+             < C o m p a n y V A T R e g i s t r a t i o n N o C a p t i o n > C o m p a n y   V A T   R e g i s t r a t i o n   N o .   C a p t i o n < / C o m p a n y V A T R e g i s t r a t i o n N o C a p t i o n > + 
+             < C o m p a n y R e g i s t r a t i o n N o > C o m p a n y   R e g i s t r a t i o n   N o . < / C o m p a n y R e g i s t r a t i o n N o > + 
+             < C o m p a n y R e g i s t r a t i o n N o C a p t i o n > C o m p a n y   R e g i s t r a t i o n   N o .   C a p t i o n < / C o m p a n y R e g i s t r a t i o n N o C a p t i o n > + 
+             < C o m p a n y B a n k N a m e > C o m p a n y   B a n k   N a m e < / C o m p a n y B a n k N a m e > + 
+             < C o m p a n y B a n k N a m e C a p t i o n > C o m p a n y   B a n k   N a m e   C a p t i o n < / C o m p a n y B a n k N a m e C a p t i o n > + 
+             < C o m p a n y B a n k A c c o u n t N o > C o m p a n y   B a n k   A c c o u n t   N o . < / C o m p a n y B a n k A c c o u n t N o > + 
+             < C o m p a n y B a n k A c c o u n t N o C a p t i o n > C o m p a n y   B a n k   A c c o u n t   N o .   C a p t i o n < / C o m p a n y B a n k A c c o u n t N o C a p t i o n > + 
+             < C o m p a n y B a n k B r a n c h N o > C o m p a n y   B a n k   B r a n c h   N o . < / C o m p a n y B a n k B r a n c h N o > + 
+             < C o m p a n y B a n k B r a n c h N o C a p t i o n > C o m p a n y   B a n k   B r a n c h   N o .   C a p t i o n < / C o m p a n y B a n k B r a n c h N o C a p t i o n > + 
+             < C o m p a n y I B A N > C o m p a n y   I B A N < / C o m p a n y I B A N > + 
+             < C o m p a n y I B A N C a p t i o n > C o m p a n y   I B A N   C a p t i o n < / C o m p a n y I B A N C a p t i o n > + 
+             < C o m p a n y B a n k S W I F T > C o m p a n y   B a n k   S W I F T < / C o m p a n y B a n k S W I F T > + 
+             < C o m p a n y B a n k S W I F T C a p t i o n > C o m p a n y   B a n k   S W I F T   C a p t i o n < / C o m p a n y B a n k S W I F T C a p t i o n > + 
+             < C o m p a n y G i r o N o > C o m p a n y   G i r o   N o . < / C o m p a n y G i r o N o > + 
+             < C o m p a n y G i r o N o C a p t i o n > C o m p a n y   G i r o   N o .   C a p t i o n < / C o m p a n y G i r o N o C a p t i o n > + 
+         < / C o m p a n y M e t a d a t a > + 
      < / B C R e p o r t I n f o r m a t i o n >   
      < H e a d e r > @@ -13800,9 +13880,13 @@
  
              < T o t a l I n v o i c e D i s c o u n t A m o u n t > T o t a l I n v o i c e D i s c o u n t A m o u n t < / T o t a l I n v o i c e D i s c o u n t A m o u n t >   
+             < T o t a l I V A _ H a g e n > T o t a l I V A _ H a g e n < / T o t a l I V A _ H a g e n > + 
              < T o t a l N e t A m o u n t > T o t a l N e t A m o u n t < / T o t a l N e t A m o u n t >   
              < T o t a l P a y m e n t D i s c o u n t O n V A T > T o t a l P a y m e n t D i s c o u n t O n V A T < / T o t a l P a y m e n t D i s c o u n t O n V A T > + 
+             < T o t a l R E _ H a g e n > T o t a l R E _ H a g e n < / T o t a l R E _ H a g e n >   
              < T o t a l S u b T o t a l > T o t a l S u b T o t a l < / T o t a l S u b T o t a l >   
@@ -13851,6 +13935,8 @@
  
              < R e p o r t N a m e > R e p o r t   N a m e < / R e p o r t N a m e >   
+             < R e p o r t C a p t i o n > R e p o r t   C a p t i o n < / R e p o r t C a p t i o n > + 
              < A b o u t T h i s R e p o r t T i t l e > A b o u t   T h i s   R e p o r t   T i t l e < / A b o u t T h i s R e p o r t T i t l e >   
              < A b o u t T h i s R e p o r t T e x t > A b o u t   T h i s   R e p o r t   T e x t < / A b o u t T h i s R e p o r t T e x t > @@ -13897,6 +13983,84 @@
  
          < / R e p o r t R e q u e s t >   
+         < C o m p a n y M e t a d a t a > + 
+             < C o m p a n y N a m e > C o m p a n y   N a m e < / C o m p a n y N a m e > + 
+             < C o m p a n y D i s p l a y N a m e > C o m p a n y   D i s p l a y   N a m e < / C o m p a n y D i s p l a y N a m e > + 
+             < C o m p a n y A d d r e s s L i n e s > + 
+                 < C o m p a n y A d d r e s s L i n e 1 > C o m p a n y   A d d r e s s   L i n e   1 < / C o m p a n y A d d r e s s L i n e 1 > + 
+                 < C o m p a n y A d d r e s s L i n e 2 > C o m p a n y   A d d r e s s   L i n e   2 < / C o m p a n y A d d r e s s L i n e 2 > + 
+                 < C o m p a n y A d d r e s s L i n e 3 > C o m p a n y   A d d r e s s   L i n e   3 < / C o m p a n y A d d r e s s L i n e 3 > + 
+                 < C o m p a n y A d d r e s s L i n e 4 > C o m p a n y   A d d r e s s   L i n e   4 < / C o m p a n y A d d r e s s L i n e 4 > + 
+                 < C o m p a n y A d d r e s s L i n e 5 > C o m p a n y   A d d r e s s   L i n e   5 < / C o m p a n y A d d r e s s L i n e 5 > + 
+                 < C o m p a n y A d d r e s s L i n e 6 > C o m p a n y   A d d r e s s   L i n e   6 < / C o m p a n y A d d r e s s L i n e 6 > + 
+                 < C o m p a n y A d d r e s s L i n e 7 > C o m p a n y   A d d r e s s   L i n e   7 < / C o m p a n y A d d r e s s L i n e 7 > + 
+                 < C o m p a n y A d d r e s s L i n e 8 > C o m p a n y   A d d r e s s   L i n e   8 < / C o m p a n y A d d r e s s L i n e 8 > + 
+             < / C o m p a n y A d d r e s s L i n e s > + 
+             < C o m p a n y P h o n e > C o m p a n y   P h o n e < / C o m p a n y P h o n e > + 
+             < C o m p a n y P h o n e C a p t i o n > C o m p a n y   P h o n e   C a p t i o n < / C o m p a n y P h o n e C a p t i o n > + 
+             < C o m p a n y F a x N o > C o m p a n y   F a x   N o . < / C o m p a n y F a x N o > + 
+             < C o m p a n y F a x N o C a p t i o n > C o m p a n y   F a x   N o .   C a p t i o n < / C o m p a n y F a x N o C a p t i o n > + 
+             < C o m p a n y E m a i l > C o m p a n y   E m a i l < / C o m p a n y E m a i l > + 
+             < C o m p a n y E m a i l C a p t i o n > C o m p a n y   E m a i l   C a p t i o n < / C o m p a n y E m a i l C a p t i o n > + 
+             < C o m p a n y H o m e P a g e > C o m p a n y   H o m e   P a g e < / C o m p a n y H o m e P a g e > + 
+             < C o m p a n y H o m e P a g e C a p t i o n > C o m p a n y   H o m e   P a g e   C a p t i o n < / C o m p a n y H o m e P a g e C a p t i o n > + 
+             < C o m p a n y L o g o > C o m p a n y   L o g o < / C o m p a n y L o g o > + 
+             < C o m p a n y V A T R e g i s t r a t i o n N o > C o m p a n y   V A T   R e g i s t r a t i o n   N o . < / C o m p a n y V A T R e g i s t r a t i o n N o > + 
+             < C o m p a n y V A T R e g i s t r a t i o n N o C a p t i o n > C o m p a n y   V A T   R e g i s t r a t i o n   N o .   C a p t i o n < / C o m p a n y V A T R e g i s t r a t i o n N o C a p t i o n > + 
+             < C o m p a n y R e g i s t r a t i o n N o > C o m p a n y   R e g i s t r a t i o n   N o . < / C o m p a n y R e g i s t r a t i o n N o > + 
+             < C o m p a n y R e g i s t r a t i o n N o C a p t i o n > C o m p a n y   R e g i s t r a t i o n   N o .   C a p t i o n < / C o m p a n y R e g i s t r a t i o n N o C a p t i o n > + 
+             < C o m p a n y B a n k N a m e > C o m p a n y   B a n k   N a m e < / C o m p a n y B a n k N a m e > + 
+             < C o m p a n y B a n k N a m e C a p t i o n > C o m p a n y   B a n k   N a m e   C a p t i o n < / C o m p a n y B a n k N a m e C a p t i o n > + 
+             < C o m p a n y B a n k A c c o u n t N o > C o m p a n y   B a n k   A c c o u n t   N o . < / C o m p a n y B a n k A c c o u n t N o > + 
+             < C o m p a n y B a n k A c c o u n t N o C a p t i o n > C o m p a n y   B a n k   A c c o u n t   N o .   C a p t i o n < / C o m p a n y B a n k A c c o u n t N o C a p t i o n > + 
+             < C o m p a n y B a n k B r a n c h N o > C o m p a n y   B a n k   B r a n c h   N o . < / C o m p a n y B a n k B r a n c h N o > + 
+             < C o m p a n y B a n k B r a n c h N o C a p t i o n > C o m p a n y   B a n k   B r a n c h   N o .   C a p t i o n < / C o m p a n y B a n k B r a n c h N o C a p t i o n > + 
+             < C o m p a n y I B A N > C o m p a n y   I B A N < / C o m p a n y I B A N > + 
+             < C o m p a n y I B A N C a p t i o n > C o m p a n y   I B A N   C a p t i o n < / C o m p a n y I B A N C a p t i o n > + 
+             < C o m p a n y B a n k S W I F T > C o m p a n y   B a n k   S W I F T < / C o m p a n y B a n k S W I F T > + 
+             < C o m p a n y B a n k S W I F T C a p t i o n > C o m p a n y   B a n k   S W I F T   C a p t i o n < / C o m p a n y B a n k S W I F T C a p t i o n > + 
+             < C o m p a n y G i r o N o > C o m p a n y   G i r o   N o . < / C o m p a n y G i r o N o > + 
+             < C o m p a n y G i r o N o C a p t i o n > C o m p a n y   G i r o   N o .   C a p t i o n < / C o m p a n y G i r o N o C a p t i o n > + 
+         < / C o m p a n y M e t a d a t a > + 
      < / B C R e p o r t I n f o r m a t i o n >   
      < T o o l t i p s   / > @@ -14379,9 +14543,13 @@
  
              < T o t a l I n v o i c e D i s c o u n t A m o u n t   E l e m e n t T y p e = " C o l u m n "   E l e m e n t I d = " 4 0 2 1 7 7 5 1 "   D a t a T y p e = " S t r i n g " > T o t a l I n v o i c e D i s c o u n t A m o u n t < / T o t a l I n v o i c e D i s c o u n t A m o u n t >   
+             < T o t a l I V A _ H a g e n   E l e m e n t T y p e = " C o l u m n "   E l e m e n t I d = " 1 2 9 2 9 2 7 9 4 7 "   D a t a T y p e = " D e c i m a l " > T o t a l I V A _ H a g e n < / T o t a l I V A _ H a g e n > + 
              < T o t a l N e t A m o u n t   E l e m e n t T y p e = " C o l u m n "   E l e m e n t I d = " 4 8 3 1 9 3 3 7 2 "   D a t a T y p e = " S t r i n g " > T o t a l N e t A m o u n t < / T o t a l N e t A m o u n t >   
              < T o t a l P a y m e n t D i s c o u n t O n V A T   E l e m e n t T y p e = " C o l u m n "   E l e m e n t I d = " 7 3 6 0 4 1 8 8 6 "   D a t a T y p e = " D e c i m a l " > T o t a l P a y m e n t D i s c o u n t O n V A T < / T o t a l P a y m e n t D i s c o u n t O n V A T > + 
+             < T o t a l R E _ H a g e n   E l e m e n t T y p e = " C o l u m n "   E l e m e n t I d = " 7 0 6 3 0 5 4 2 "   D a t a T y p e = " D e c i m a l " > T o t a l R E _ H a g e n < / T o t a l R E _ H a g e n >   
              < T o t a l S u b T o t a l   E l e m e n t T y p e = " C o l u m n "   E l e m e n t I d = " 2 0 9 7 8 7 6 8 0 1 "   D a t a T y p e = " S t r i n g " > T o t a l S u b T o t a l < / T o t a l S u b T o t a l >   

</xml_diff>